<commit_message>
chore: preserve protected QA document and source import tests
</commit_message>
<xml_diff>
--- a/capstone/docs/teacher-fixed-question-documents/grade1-easy-basic-addition-set-a.docx
+++ b/capstone/docs/teacher-fixed-question-documents/grade1-easy-basic-addition-set-a.docx
@@ -21,13 +21,13 @@
         <w:spacing w:after="240"/>
       </w:pPr>
       <w:r>
-        <w:rPr>
-          <w:rFonts w:ascii="Calibri" w:hAnsi="Calibri"/>
-          <w:b w:val="0"/>
-          <w:color w:val="1F4D78"/>
-          <w:sz w:val="22"/>
-        </w:rPr>
-        <w:t>Grade 1 · Easy · Basic Addition · 5 Questions</w:t>
+        <w:t>Grade 1</w:t>
+      </w:r>
+    </w:p>
+    <w:p>
+      <w:pPr/>
+      <w:r>
+        <w:t>Easy – Lesson: Basic Addition</w:t>
       </w:r>
     </w:p>
     <w:p>
@@ -35,13 +35,7 @@
         <w:spacing w:after="240" w:line="300" w:lineRule="auto"/>
       </w:pPr>
       <w:r>
-        <w:rPr>
-          <w:rFonts w:ascii="Calibri" w:hAnsi="Calibri"/>
-          <w:b w:val="0"/>
-          <w:color w:val="3A3A3A"/>
-          <w:sz w:val="20"/>
-        </w:rPr>
-        <w:t>Teacher upload instructions: select Fixed Questions, choose Grade 1, Easy, and Basic Addition. Keep every question, four choices, and Answer line unchanged.</w:t>
+        <w:t>Teacher upload instructions: select Fixed Questions, choose Grade 1 and Easy. Keep every question, four choices, and Answer line unchanged.</w:t>
       </w:r>
     </w:p>
     <w:p>

</xml_diff>